<commit_message>
Add live events and community to flywheel, business model, and brief
Singles supper clubs, meet cute meetups, storytime nights (The Moth
meets Modern Love). Fourth revenue line on slide 10. Extended flywheel
on slide 5. Full concept documented in Master Brief.

Co-Authored-By: Claude Opus 4.6 <noreply@anthropic.com>
</commit_message>
<xml_diff>
--- a/PitchLive.docx
+++ b/PitchLive.docx
@@ -492,6 +492,18 @@
       </w:pPr>
       <w:r>
         <w:t xml:space="preserve">The publisher gets fresh material. For free.</w:t>
+      </w:r>
+    </w:p>
+    <w:p>
+      <w:pPr>
+        <w:pStyle w:val="Compact"/>
+        <w:numPr>
+          <w:ilvl w:val="0"/>
+          <w:numId w:val="1005"/>
+        </w:numPr>
+      </w:pPr>
+      <w:r>
+        <w:t xml:space="preserve">It doesn’t stay digital. Singles supper clubs. Meet cute meetups. Storytime nights (The Moth meets Modern Love).</w:t>
       </w:r>
     </w:p>
     <w:p>
@@ -1047,6 +1059,30 @@
             </w:pPr>
             <w:r>
               <w:t xml:space="preserve">OpenTable, Resy, TimeOut. Warm leads, not cold ads.</w:t>
+            </w:r>
+          </w:p>
+        </w:tc>
+      </w:tr>
+      <w:tr>
+        <w:tc>
+          <w:tcPr/>
+          <w:p>
+            <w:pPr>
+              <w:pStyle w:val="Compact"/>
+            </w:pPr>
+            <w:r>
+              <w:t xml:space="preserve">Live events</w:t>
+            </w:r>
+          </w:p>
+        </w:tc>
+        <w:tc>
+          <w:tcPr/>
+          <w:p>
+            <w:pPr>
+              <w:pStyle w:val="Compact"/>
+            </w:pPr>
+            <w:r>
+              <w:t xml:space="preserve">Supper clubs, meetups, storytime. Tickets + sponsorship.</w:t>
             </w:r>
           </w:p>
         </w:tc>

</xml_diff>